<commit_message>
Remove unused reference from Painel
Co-Authored-By: Claude Sonnet 5.5 <noreply@anthropic.com>
Claude-Session: https://claude.ai/code/session_015AGSt81GPbHH6yYpGnQKdU
</commit_message>
<xml_diff>
--- a/Inc 3/O_Painel_do_Grau_de_Companheiro.docx
+++ b/Inc 3/O_Painel_do_Grau_de_Companheiro.docx
@@ -352,20 +352,6 @@
         <w:t>Ritual do Grau de Companheiro Maçom do Rito Brasileiro. [completar com edição, obediência e ano].</w:t>
       </w:r>
     </w:p>
-    <w:p>
-      <w:pPr>
-        <w:spacing w:line="240" w:lineRule="auto" w:before="0" w:after="120"/>
-        <w:jc w:val="left"/>
-      </w:pPr>
-      <w:r>
-        <w:rPr>
-          <w:rFonts w:ascii="Times New Roman" w:hAnsi="Times New Roman"/>
-          <w:b w:val="0"/>
-          <w:sz w:val="24"/>
-        </w:rPr>
-        <w:t>A MAÇONARIA no processo da Independência do Brasil. Folha BV. Disponível em: https://www.folhabv.com.br/?p=114481. Acesso em: 26 out. 2026.</w:t>
-      </w:r>
-    </w:p>
     <w:sectPr>
       <w:pgSz w:w="11906" w:h="16838"/>
       <w:pgMar w:top="1134" w:right="1134" w:bottom="1134" w:left="1701" w:header="720" w:footer="720" w:gutter="0"/>

</xml_diff>

<commit_message>
Painel: cite source for tracing-board history
Co-Authored-By: Claude Sonnet 5.5 <noreply@anthropic.com>
Claude-Session: https://claude.ai/code/session_015AGSt81GPbHH6yYpGnQKdU
</commit_message>
<xml_diff>
--- a/Inc 3/O_Painel_do_Grau_de_Companheiro.docx
+++ b/Inc 3/O_Painel_do_Grau_de_Companheiro.docx
@@ -71,7 +71,7 @@
           <w:b w:val="0"/>
           <w:sz w:val="24"/>
         </w:rPr>
-        <w:t>A prática de recorrer a imagens para ensinar tem uma longa história na Maçonaria. Nas lojas do século XVIII, os símbolos do grau eram traçados com giz e carvão no piso do local de reunião e, terminada a sessão, apagados pelos próprios Irmãos. Com o tempo, esses desenhos foram transpostos para tapetes e telas, que deram origem aos painéis hoje conhecidos. O Painel, portanto, não é um simples adorno: é o texto visual do grau, uma espécie de lição silenciosa que dispensa tradução, pois cada Irmão pode lê-la segundo o seu grau de maturidade. Quem a contempla com atenção descobre que o desenho não pretende explicar tudo, mas provocar a reflexão.</w:t>
+        <w:t>A prática de recorrer a imagens para ensinar tem uma longa história na Maçonaria. Nas primeiras lojas, ainda no século XVIII, os símbolos do grau eram traçados com giz no piso do local de reunião e apagados ao final da sessão (GRAND LODGE OF BRITISH COLUMBIA AND YUKON, [s.d.]). Com o tempo, esses desenhos foram transpostos para tapetes e telas, que deram origem aos painéis hoje conhecidos. O Painel, portanto, não é um simples adorno: é o texto visual do grau, uma espécie de lição silenciosa que dispensa tradução, pois cada Irmão pode lê-la segundo o seu grau de maturidade. Quem a contempla com atenção descobre que o desenho não pretende explicar tudo, mas provocar a reflexão.</w:t>
       </w:r>
     </w:p>
     <w:p>
@@ -308,6 +308,20 @@
           <w:sz w:val="24"/>
         </w:rPr>
         <w:t>BOUCHER, Jules. A Simbólica Maçônica. São Paulo: Pensamento, 1994.</w:t>
+      </w:r>
+    </w:p>
+    <w:p>
+      <w:pPr>
+        <w:spacing w:line="240" w:lineRule="auto" w:before="0" w:after="120"/>
+        <w:jc w:val="left"/>
+      </w:pPr>
+      <w:r>
+        <w:rPr>
+          <w:rFonts w:ascii="Times New Roman" w:hAnsi="Times New Roman"/>
+          <w:b w:val="0"/>
+          <w:sz w:val="24"/>
+        </w:rPr>
+        <w:t>GRAND LODGE OF BRITISH COLUMBIA AND YUKON. Tracing Boards. Disponível em: https://www.freemasonry.bcy.ca/symbolism/tracing_boards/index.html. Acesso em: 26 out. 2026.</w:t>
       </w:r>
     </w:p>
     <w:p>

</xml_diff>

<commit_message>
Rename Estrela Flamígera to Estrela Flamejante
Co-Authored-By: Claude Sonnet 5.5 <noreply@anthropic.com>
Claude-Session: https://claude.ai/code/session_015AGSt81GPbHH6yYpGnQKdU
</commit_message>
<xml_diff>
--- a/Inc 3/O_Painel_do_Grau_de_Companheiro.docx
+++ b/Inc 3/O_Painel_do_Grau_de_Companheiro.docx
@@ -86,7 +86,7 @@
           <w:b w:val="0"/>
           <w:sz w:val="24"/>
         </w:rPr>
-        <w:t>Convém, ainda, comparar o Painel de Companheiro com o de Aprendiz. Neste último, o acento recai sobre o início da obra: a Pedra Bruta, a Pedra Cúbica ainda como promessa, as primeiras ferramentas e o simbolismo da purificação. No Painel de Companheiro, a obra já está em andamento. Aparecem as duas colunas com seus globos, a Estrela Flamígera com o G em lugar de destaque, a escadaria e a porta, sinais de que o obreiro avança e de que lhe são apresentados horizontes mais amplos. A mudança de grau é, assim, uma mudança de olhar: o que antes era apenas instrução moral passa a ser, também, convite ao conhecimento das ciências e das leis da natureza.</w:t>
+        <w:t>Convém, ainda, comparar o Painel de Companheiro com o de Aprendiz. Neste último, o acento recai sobre o início da obra: a Pedra Bruta, a Pedra Cúbica ainda como promessa, as primeiras ferramentas e o simbolismo da purificação. No Painel de Companheiro, a obra já está em andamento. Aparecem as duas colunas com seus globos, a Estrela Flamejante com o G em lugar de destaque, a escadaria e a porta, sinais de que o obreiro avança e de que lhe são apresentados horizontes mais amplos. A mudança de grau é, assim, uma mudança de olhar: o que antes era apenas instrução moral passa a ser, também, convite ao conhecimento das ciências e das leis da natureza.</w:t>
       </w:r>
     </w:p>
     <w:p>
@@ -131,7 +131,7 @@
           <w:b w:val="0"/>
           <w:sz w:val="24"/>
         </w:rPr>
-        <w:t>Ao centro do Painel brilha a Estrela Flamígera, com a letra G inscrita em seu interior. O G é entendido de três maneiras que se completam: Geometria, a ciência da medida e fundamento da arquitetura e das demais ciências; Gnose, o conhecimento que ilumina; e Grande Arquiteto do Universo, o princípio criador a quem o Maçom rende homenagem, qualquer que seja a sua religião. A estrela de cinco pontas recorda também o homem de braços e pernas abertos, com a cabeça no ápice, e o número cinco, tão presente neste grau, que lembra os cinco sentidos, as cinco ordens da arquitetura e os anos simbólicos do Companheiro. Em torno do G, o esquadro e o compasso, entrelaçados, indicam a retidão da conduta e a justa medida das paixões, a matéria e o espírito, a terra e o céu.</w:t>
+        <w:t>Ao centro do Painel brilha a Estrela Flamejante, com a letra G inscrita em seu interior. O G é entendido de três maneiras que se completam: Geometria, a ciência da medida e fundamento da arquitetura e das demais ciências; Gnose, o conhecimento que ilumina; e Grande Arquiteto do Universo, o princípio criador a quem o Maçom rende homenagem, qualquer que seja a sua religião. A estrela de cinco pontas recorda também o homem de braços e pernas abertos, com a cabeça no ápice, e o número cinco, tão presente neste grau, que lembra os cinco sentidos, as cinco ordens da arquitetura e os anos simbólicos do Companheiro. Em torno do G, o esquadro e o compasso, entrelaçados, indicam a retidão da conduta e a justa medida das paixões, a matéria e o espírito, a terra e o céu.</w:t>
       </w:r>
     </w:p>
     <w:p>

</xml_diff>